<commit_message>
docs: remove platform branding from guide
</commit_message>
<xml_diff>
--- a/Claude_Code_从零到精通_完全指南.docx
+++ b/Claude_Code_从零到精通_完全指南.docx
@@ -180,7 +180,7 @@
         <w:rPr>
           <w:sz w:val="20"/>
         </w:rPr>
-        <w:t>第十章  IDE 与终端集成 — VS Code / JetBrains / WispTerm Skill 注册</w:t>
+        <w:t>第十章  IDE 与终端集成 — VS Code / JetBrains / 本地终端 Skill 注册</w:t>
       </w:r>
     </w:p>
     <w:p>
@@ -5290,12 +5290,12 @@
         <w:pStyle w:val="Heading2"/>
       </w:pPr>
       <w:r>
-        <w:t>10.3 WispTerm</w:t>
+        <w:t>10.3 本地终端</w:t>
       </w:r>
     </w:p>
     <w:p>
       <w:r>
-        <w:t>WispTerm 终端中直接使用 claude 命令，或让 AI Agent 调用它。</w:t>
+        <w:t>本地终端中直接使用 claude 命令，或让 AI Agent 调用它。</w:t>
       </w:r>
     </w:p>
     <w:p>
@@ -5303,12 +5303,12 @@
         <w:pStyle w:val="Heading2"/>
       </w:pPr>
       <w:r>
-        <w:t>10.4 🏗️ 将此 Skill 注册到 WispTerm</w:t>
+        <w:t>10.4 🏗️ 将此 Skill 注册到 本地终端</w:t>
       </w:r>
     </w:p>
     <w:p>
       <w:r>
-        <w:t>将 SKILL.md 保存到 WispTerm 的 skills 目录即可使 Agent 调用：</w:t>
+        <w:t>将 SKILL.md 保存到 本地终端 的 skills 目录即可使 Agent 调用：</w:t>
       </w:r>
     </w:p>
     <w:p>
@@ -5331,11 +5331,11 @@
           <w:color w:val="CDD6F4"/>
           <w:sz w:val="18"/>
         </w:rPr>
-        <w:t>mkdir "%USERPROFILE%\.wispterm\skills\claude-test"</w:t>
+        <w:t>mkdir "%USERPROFILE%\.本地终端\skills\claude-test"</w:t>
         <w:br/>
-        <w:t>copy SKILL.md "%USERPROFILE%\.wispterm\skills\claude-test\SKILL.md"</w:t>
+        <w:t>copy SKILL.md "%USERPROFILE%\.本地终端\skills\claude-test\SKILL.md"</w:t>
         <w:br/>
-        <w:t># 重启 WispTerm</w:t>
+        <w:t># 重启 本地终端</w:t>
       </w:r>
     </w:p>
     <w:p>
@@ -5358,9 +5358,9 @@
           <w:color w:val="CDD6F4"/>
           <w:sz w:val="18"/>
         </w:rPr>
-        <w:t>mkdir "%APPDATA%\wispterm\skills\claude-test"</w:t>
+        <w:t>mkdir "%APPDATA%\本地终端\skills\claude-test"</w:t>
         <w:br/>
-        <w:t>copy SKILL.md "%APPDATA%\wispterm\skills\claude-test\SKILL.md"</w:t>
+        <w:t>copy SKILL.md "%APPDATA%\本地终端\skills\claude-test\SKILL.md"</w:t>
       </w:r>
     </w:p>
     <w:p>
@@ -5383,9 +5383,9 @@
           <w:color w:val="CDD6F4"/>
           <w:sz w:val="18"/>
         </w:rPr>
-        <w:t>mkdir -p ~/.config/wispterm/skills/claude-test</w:t>
+        <w:t>mkdir -p ~/.config/本地终端/skills/claude-test</w:t>
         <w:br/>
-        <w:t>cp SKILL.md ~/.config/wispterm/skills/claude-test/SKILL.md</w:t>
+        <w:t>cp SKILL.md ~/.config/本地终端/skills/claude-test/SKILL.md</w:t>
       </w:r>
     </w:p>
     <w:p>
@@ -5399,7 +5399,7 @@
           <w:color w:val="0C546A"/>
           <w:sz w:val="20"/>
         </w:rPr>
-        <w:t>💡 注册后，在 WispTerm 中输入 $claude-test 即可加载此技能。</w:t>
+        <w:t>💡 注册后，在 本地终端 中输入 $claude-test 即可加载此技能。</w:t>
       </w:r>
     </w:p>
     <w:p>

</xml_diff>